<commit_message>
OFI Template new variable
</commit_message>
<xml_diff>
--- a/public/templates/Memòria_justificativa_OFI.docx
+++ b/public/templates/Memòria_justificativa_OFI.docx
@@ -1556,7 +1556,23 @@
           <w:sz w:val="20"/>
           <w:szCs w:val="20"/>
         </w:rPr>
-        <w:t xml:space="preserve"> va ser seleccionat atès </w:t>
+        <w:t xml:space="preserve"> va ser seleccionat </w:t>
+      </w:r>
+      <w:r>
+        <w:rPr>
+          <w:rFonts w:ascii="Open Sans Light" w:eastAsia="Open Sans Light" w:hAnsi="Open Sans Light" w:cs="Open Sans Light"/>
+          <w:sz w:val="20"/>
+          <w:szCs w:val="20"/>
+        </w:rPr>
+        <w:t>baix el criteri de</w:t>
+      </w:r>
+      <w:r>
+        <w:rPr>
+          <w:rFonts w:ascii="Open Sans Light" w:eastAsia="Open Sans Light" w:hAnsi="Open Sans Light" w:cs="Open Sans Light"/>
+          <w:sz w:val="20"/>
+          <w:szCs w:val="20"/>
+        </w:rPr>
+        <w:t xml:space="preserve"> </w:t>
       </w:r>
       <w:r>
         <w:rPr>
@@ -1595,15 +1611,6 @@
     </w:p>
     <w:p>
       <w:pPr>
-        <w:rPr>
-          <w:rFonts w:ascii="Open Sans Light" w:eastAsia="Open Sans Light" w:hAnsi="Open Sans Light" w:cs="Open Sans Light"/>
-          <w:sz w:val="20"/>
-          <w:szCs w:val="20"/>
-        </w:rPr>
-      </w:pPr>
-    </w:p>
-    <w:p>
-      <w:pPr>
         <w:jc w:val="both"/>
         <w:rPr>
           <w:rFonts w:ascii="Open Sans Light" w:eastAsia="Open Sans Light" w:hAnsi="Open Sans Light" w:cs="Open Sans Light"/>
@@ -1611,12 +1618,13 @@
           <w:szCs w:val="20"/>
         </w:rPr>
       </w:pPr>
+      <w:bookmarkStart w:id="0" w:name="_GoBack"/>
+      <w:bookmarkEnd w:id="0"/>
     </w:p>
     <w:p>
       <w:pPr>
         <w:jc w:val="both"/>
         <w:rPr>
-          <w:rStyle w:val="normaltextrun"/>
           <w:rFonts w:ascii="Open Sans Light" w:eastAsia="Open Sans Light" w:hAnsi="Open Sans Light" w:cs="Open Sans Light"/>
           <w:sz w:val="20"/>
           <w:szCs w:val="20"/>
@@ -1635,15 +1643,9 @@
       <w:pPr>
         <w:jc w:val="both"/>
         <w:rPr>
-          <w:rStyle w:val="normaltextrun"/>
-          <w:rFonts w:ascii="Open Sans Light" w:eastAsia="Times New Roman" w:hAnsi="Open Sans Light" w:cs="Open Sans Light"/>
-          <w:i/>
-          <w:iCs/>
-          <w:kern w:val="0"/>
-          <w:sz w:val="20"/>
-          <w:szCs w:val="20"/>
-          <w:shd w:val="clear" w:color="auto" w:fill="FFFF00"/>
-          <w:lang w:eastAsia="es-ES" w:bidi="ar-SA"/>
+          <w:rFonts w:ascii="Open Sans Light" w:eastAsia="Open Sans Light" w:hAnsi="Open Sans Light" w:cs="Open Sans Light"/>
+          <w:sz w:val="20"/>
+          <w:szCs w:val="20"/>
         </w:rPr>
       </w:pPr>
     </w:p>
@@ -1863,7 +1865,6 @@
           <w:szCs w:val="20"/>
           <w:lang w:eastAsia="es-ES" w:bidi="ar-SA"/>
         </w:rPr>
-        <w:lastRenderedPageBreak/>
         <w:t>JUSTIFICACIÓ I VALORACIÓ QUE EL PREU, IMPORT O QUANTIA PROPOSADA S’AJUSTA AL DE MERCAT, A LES TARIFES OFICIALS O ALS IMPORTS REGLAMENTARIS, SEGONS PROCEDEIXI</w:t>
       </w:r>
       <w:r>
@@ -2344,7 +2345,6 @@
           <w:szCs w:val="20"/>
         </w:rPr>
       </w:pPr>
-      <w:bookmarkStart w:id="0" w:name="_GoBack"/>
       <w:r>
         <w:rPr>
           <w:rFonts w:ascii="Open Sans Light" w:eastAsia="Open Sans Light" w:hAnsi="Open Sans Light" w:cs="Open Sans Light"/>
@@ -2395,7 +2395,6 @@
         <w:t>}}:</w:t>
       </w:r>
     </w:p>
-    <w:bookmarkEnd w:id="0"/>
     <w:p>
       <w:pPr>
         <w:keepLines/>
@@ -2638,16 +2637,7 @@
           <w:sz w:val="20"/>
           <w:szCs w:val="20"/>
         </w:rPr>
-        <w:t xml:space="preserve">De conformitat amb la documentació obrant a l’expedient i amb el que disposa la base 29 de les d’execució del pressupost del Consell de Mallorca per a l’any 2026, l’article 1089 del Codi civil i l’article 60.2 del RD 500/1990, és procedent el reconeixement de les despeses per tal d'evitar l'enriquiment injust que suposaria no pagar a tercers els </w:t>
-      </w:r>
-      <w:r>
-        <w:rPr>
-          <w:rFonts w:ascii="Open Sans Light" w:hAnsi="Open Sans Light" w:cs="Open Sans Light"/>
-          <w:sz w:val="20"/>
-          <w:szCs w:val="20"/>
-        </w:rPr>
-        <w:lastRenderedPageBreak/>
-        <w:t>drets adquirits davant la corporació i obligar a haver de recórrer davant els tribunals de justícia per el cobrament del seu crèdit. </w:t>
+        <w:t>De conformitat amb la documentació obrant a l’expedient i amb el que disposa la base 29 de les d’execució del pressupost del Consell de Mallorca per a l’any 2026, l’article 1089 del Codi civil i l’article 60.2 del RD 500/1990, és procedent el reconeixement de les despeses per tal d'evitar l'enriquiment injust que suposaria no pagar a tercers els drets adquirits davant la corporació i obligar a haver de recórrer davant els tribunals de justícia per el cobrament del seu crèdit. </w:t>
       </w:r>
     </w:p>
     <w:p>
@@ -2681,6 +2671,7 @@
           <w:sz w:val="20"/>
           <w:szCs w:val="20"/>
         </w:rPr>
+        <w:lastRenderedPageBreak/>
         <w:t>Les unitats subministrades/prestades són les estrictament necessàries per a la realització de les  prestacions.</w:t>
       </w:r>
       <w:r>
@@ -3133,6 +3124,7 @@
           <w:sz w:val="20"/>
           <w:szCs w:val="20"/>
         </w:rPr>
+        <w:lastRenderedPageBreak/>
         <w:t>És procedent el reconeixement de la despesa per tal d'evitar l'enriquiment injust que suposaria no pagar a tercers els drets adquirits davant la corporació i obligar als particulars a haver de recórrer davant els tribunals de justícia per el cobrament dels seus crèdits. </w:t>
       </w:r>
     </w:p>
@@ -9446,7 +9438,6 @@
   <w:style w:type="character" w:default="1" w:styleId="Fuentedeprrafopredeter">
     <w:name w:val="Default Paragraph Font"/>
     <w:uiPriority w:val="1"/>
-    <w:semiHidden/>
     <w:unhideWhenUsed/>
   </w:style>
   <w:style w:type="table" w:default="1" w:styleId="Tablanormal">
@@ -10274,7 +10265,7 @@
 </file>
 
 <file path=customXml/itemProps4.xml><?xml version="1.0" encoding="utf-8"?>
-<ds:datastoreItem xmlns:ds="http://schemas.openxmlformats.org/officeDocument/2006/customXml" ds:itemID="{EEE74B99-9CCD-4AB5-A6E6-0458379C5721}">
+<ds:datastoreItem xmlns:ds="http://schemas.openxmlformats.org/officeDocument/2006/customXml" ds:itemID="{B47DCD74-60EB-4EE6-93DC-DDD9FD32E6BD}">
   <ds:schemaRefs>
     <ds:schemaRef ds:uri="http://schemas.openxmlformats.org/officeDocument/2006/bibliography"/>
   </ds:schemaRefs>

</xml_diff>

<commit_message>
OFI price justification classified
</commit_message>
<xml_diff>
--- a/public/templates/Memòria_justificativa_OFI.docx
+++ b/public/templates/Memòria_justificativa_OFI.docx
@@ -1822,18 +1822,131 @@
           <w:sz w:val="20"/>
           <w:szCs w:val="20"/>
         </w:rPr>
-        <w:t>s’ajusten als preu de mercat  acreditat pels següents motius:  </w:t>
-      </w:r>
-    </w:p>
-    <w:p>
-      <w:pPr>
-        <w:jc w:val="both"/>
-        <w:rPr>
-          <w:rFonts w:ascii="Open Sans Light" w:hAnsi="Open Sans Light" w:cs="Open Sans Light"/>
-          <w:sz w:val="20"/>
-          <w:szCs w:val="20"/>
-        </w:rPr>
-      </w:pPr>
+        <w:t xml:space="preserve">s’ajusten als </w:t>
+      </w:r>
+      <w:r>
+        <w:rPr>
+          <w:rFonts w:ascii="Open Sans Light" w:hAnsi="Open Sans Light" w:cs="Open Sans Light"/>
+          <w:sz w:val="20"/>
+          <w:szCs w:val="20"/>
+        </w:rPr>
+        <w:t>preu de mercat </w:t>
+      </w:r>
+      <w:r>
+        <w:rPr>
+          <w:rFonts w:ascii="Open Sans Light" w:hAnsi="Open Sans Light" w:cs="Open Sans Light"/>
+          <w:sz w:val="20"/>
+          <w:szCs w:val="20"/>
+        </w:rPr>
+        <w:t xml:space="preserve">es detallen a </w:t>
+      </w:r>
+      <w:r>
+        <w:rPr>
+          <w:rFonts w:ascii="Open Sans Light" w:hAnsi="Open Sans Light" w:cs="Open Sans Light"/>
+          <w:sz w:val="20"/>
+          <w:szCs w:val="20"/>
+        </w:rPr>
+        <w:t>la següent classificació</w:t>
+      </w:r>
+      <w:r>
+        <w:rPr>
+          <w:rFonts w:ascii="Open Sans Light" w:hAnsi="Open Sans Light" w:cs="Open Sans Light"/>
+          <w:sz w:val="20"/>
+          <w:szCs w:val="20"/>
+        </w:rPr>
+        <w:t>:  </w:t>
+      </w:r>
+    </w:p>
+    <w:p>
+      <w:pPr>
+        <w:rPr>
+          <w:rFonts w:ascii="Open Sans Light" w:hAnsi="Open Sans Light" w:cs="Open Sans Light"/>
+          <w:sz w:val="20"/>
+          <w:szCs w:val="20"/>
+        </w:rPr>
+      </w:pPr>
+    </w:p>
+    <w:p>
+      <w:r>
+        <w:rPr>
+          <w:rFonts w:ascii="Open Sans Light" w:eastAsia="Open Sans Light" w:hAnsi="Open Sans Light" w:cs="Open Sans Light"/>
+          <w:sz w:val="20"/>
+          <w:szCs w:val="20"/>
+        </w:rPr>
+        <w:t>{{IF factures_preu_a.length}}</w:t>
+      </w:r>
+    </w:p>
+    <w:p>
+      <w:pPr>
+        <w:pStyle w:val="paragraph"/>
+        <w:numPr>
+          <w:ilvl w:val="0"/>
+          <w:numId w:val="32"/>
+        </w:numPr>
+        <w:spacing w:before="0" w:beforeAutospacing="0" w:after="0" w:afterAutospacing="0"/>
+        <w:ind w:left="0" w:firstLine="720"/>
+        <w:textAlignment w:val="baseline"/>
+        <w:rPr>
+          <w:rStyle w:val="normaltextrun"/>
+          <w:rFonts w:ascii="Open Sans Light" w:hAnsi="Open Sans Light" w:cs="Open Sans Light"/>
+          <w:sz w:val="21"/>
+          <w:szCs w:val="21"/>
+        </w:rPr>
+      </w:pPr>
+      <w:r>
+        <w:rPr>
+          <w:rStyle w:val="normaltextrun"/>
+          <w:rFonts w:ascii="Open Sans Light" w:hAnsi="Open Sans Light" w:cs="Open Sans Light"/>
+          <w:sz w:val="20"/>
+          <w:szCs w:val="20"/>
+          <w:shd w:val="clear" w:color="auto" w:fill="FFFFFF"/>
+          <w:lang w:val="ca-ES"/>
+        </w:rPr>
+        <w:t>Sol·licitats i comparats  pressuposts de proveïdors diferents, els preus dels serveis contractats i/o subministraments efectuat</w:t>
+      </w:r>
+      <w:r>
+        <w:rPr>
+          <w:rStyle w:val="normaltextrun"/>
+          <w:rFonts w:ascii="Open Sans Light" w:hAnsi="Open Sans Light" w:cs="Open Sans Light"/>
+          <w:sz w:val="20"/>
+          <w:szCs w:val="20"/>
+          <w:shd w:val="clear" w:color="auto" w:fill="FFFFFF"/>
+          <w:lang w:val="ca-ES"/>
+        </w:rPr>
+        <w:t>s s’ajusten als preus de mercat:</w:t>
+      </w:r>
+    </w:p>
+    <w:p>
+      <w:pPr>
+        <w:pStyle w:val="paragraph"/>
+        <w:spacing w:before="0" w:beforeAutospacing="0" w:after="0" w:afterAutospacing="0"/>
+        <w:textAlignment w:val="baseline"/>
+        <w:rPr>
+          <w:rStyle w:val="normaltextrun"/>
+          <w:rFonts w:ascii="Open Sans Light" w:hAnsi="Open Sans Light" w:cs="Open Sans Light"/>
+          <w:sz w:val="20"/>
+          <w:szCs w:val="20"/>
+          <w:shd w:val="clear" w:color="auto" w:fill="FFFFFF"/>
+          <w:lang w:val="ca-ES"/>
+        </w:rPr>
+      </w:pPr>
+    </w:p>
+    <w:p>
+      <w:pPr>
+        <w:rPr>
+          <w:rFonts w:ascii="Open Sans Light" w:hAnsi="Open Sans Light" w:cs="Open Sans Light"/>
+          <w:sz w:val="20"/>
+          <w:szCs w:val="20"/>
+        </w:rPr>
+      </w:pPr>
+      <w:r>
+        <w:rPr>
+          <w:rFonts w:ascii="Open Sans Light" w:hAnsi="Open Sans Light" w:cs="Open Sans Light"/>
+          <w:sz w:val="20"/>
+          <w:szCs w:val="20"/>
+        </w:rPr>
+        <w:t>{{FOR factura IN factures_preu_a}}</w:t>
+      </w:r>
     </w:p>
     <w:p>
       <w:pPr>
@@ -1846,17 +1959,59 @@
         <w:spacing w:before="120" w:line="276" w:lineRule="auto"/>
         <w:rPr>
           <w:rFonts w:ascii="Open Sans Light" w:eastAsia="Open Sans Light" w:hAnsi="Open Sans Light" w:cs="Open Sans Light"/>
-          <w:sz w:val="20"/>
-          <w:szCs w:val="20"/>
-        </w:rPr>
-      </w:pPr>
-      <w:r>
-        <w:rPr>
-          <w:rFonts w:ascii="Open Sans Light" w:eastAsia="Open Sans Light" w:hAnsi="Open Sans Light" w:cs="Open Sans Light"/>
-          <w:sz w:val="20"/>
-          <w:szCs w:val="20"/>
-        </w:rPr>
-        <w:t>{{FOR factura IN factures}}</w:t>
+          <w:b/>
+          <w:sz w:val="20"/>
+          <w:szCs w:val="20"/>
+        </w:rPr>
+      </w:pPr>
+      <w:r>
+        <w:rPr>
+          <w:rFonts w:ascii="Open Sans Light" w:eastAsia="Open Sans Light" w:hAnsi="Open Sans Light" w:cs="Open Sans Light"/>
+          <w:b/>
+          <w:sz w:val="20"/>
+          <w:szCs w:val="20"/>
+        </w:rPr>
+        <w:t>{{$</w:t>
+      </w:r>
+      <w:proofErr w:type="spellStart"/>
+      <w:r>
+        <w:rPr>
+          <w:rFonts w:ascii="Open Sans Light" w:eastAsia="Open Sans Light" w:hAnsi="Open Sans Light" w:cs="Open Sans Light"/>
+          <w:b/>
+          <w:sz w:val="20"/>
+          <w:szCs w:val="20"/>
+        </w:rPr>
+        <w:t>factura.descripcio</w:t>
+      </w:r>
+      <w:proofErr w:type="spellEnd"/>
+      <w:r>
+        <w:rPr>
+          <w:rFonts w:ascii="Open Sans Light" w:eastAsia="Open Sans Light" w:hAnsi="Open Sans Light" w:cs="Open Sans Light"/>
+          <w:b/>
+          <w:sz w:val="20"/>
+          <w:szCs w:val="20"/>
+        </w:rPr>
+        <w:t>}} - {{$</w:t>
+      </w:r>
+      <w:proofErr w:type="spellStart"/>
+      <w:r>
+        <w:rPr>
+          <w:rFonts w:ascii="Open Sans Light" w:eastAsia="Open Sans Light" w:hAnsi="Open Sans Light" w:cs="Open Sans Light"/>
+          <w:b/>
+          <w:sz w:val="20"/>
+          <w:szCs w:val="20"/>
+        </w:rPr>
+        <w:t>factura.periode</w:t>
+      </w:r>
+      <w:proofErr w:type="spellEnd"/>
+      <w:r>
+        <w:rPr>
+          <w:rFonts w:ascii="Open Sans Light" w:eastAsia="Open Sans Light" w:hAnsi="Open Sans Light" w:cs="Open Sans Light"/>
+          <w:b/>
+          <w:sz w:val="20"/>
+          <w:szCs w:val="20"/>
+        </w:rPr>
+        <w:t>}}:</w:t>
       </w:r>
     </w:p>
     <w:p>
@@ -1870,15 +2025,13 @@
         <w:spacing w:before="120" w:line="276" w:lineRule="auto"/>
         <w:rPr>
           <w:rFonts w:ascii="Open Sans Light" w:eastAsia="Open Sans Light" w:hAnsi="Open Sans Light" w:cs="Open Sans Light"/>
-          <w:b/>
-          <w:sz w:val="20"/>
-          <w:szCs w:val="20"/>
-        </w:rPr>
-      </w:pPr>
-      <w:r>
-        <w:rPr>
-          <w:rFonts w:ascii="Open Sans Light" w:eastAsia="Open Sans Light" w:hAnsi="Open Sans Light" w:cs="Open Sans Light"/>
-          <w:b/>
+          <w:sz w:val="20"/>
+          <w:szCs w:val="20"/>
+        </w:rPr>
+      </w:pPr>
+      <w:r>
+        <w:rPr>
+          <w:rFonts w:ascii="Open Sans Light" w:eastAsia="Open Sans Light" w:hAnsi="Open Sans Light" w:cs="Open Sans Light"/>
           <w:sz w:val="20"/>
           <w:szCs w:val="20"/>
         </w:rPr>
@@ -1888,41 +2041,19 @@
       <w:r>
         <w:rPr>
           <w:rFonts w:ascii="Open Sans Light" w:eastAsia="Open Sans Light" w:hAnsi="Open Sans Light" w:cs="Open Sans Light"/>
-          <w:b/>
-          <w:sz w:val="20"/>
-          <w:szCs w:val="20"/>
-        </w:rPr>
-        <w:t>factura.descripcio</w:t>
+          <w:sz w:val="20"/>
+          <w:szCs w:val="20"/>
+        </w:rPr>
+        <w:t>factura.record.explicacio_preu</w:t>
       </w:r>
       <w:proofErr w:type="spellEnd"/>
       <w:r>
         <w:rPr>
           <w:rFonts w:ascii="Open Sans Light" w:eastAsia="Open Sans Light" w:hAnsi="Open Sans Light" w:cs="Open Sans Light"/>
-          <w:b/>
-          <w:sz w:val="20"/>
-          <w:szCs w:val="20"/>
-        </w:rPr>
-        <w:t>}} - {{$</w:t>
-      </w:r>
-      <w:proofErr w:type="spellStart"/>
-      <w:r>
-        <w:rPr>
-          <w:rFonts w:ascii="Open Sans Light" w:eastAsia="Open Sans Light" w:hAnsi="Open Sans Light" w:cs="Open Sans Light"/>
-          <w:b/>
-          <w:sz w:val="20"/>
-          <w:szCs w:val="20"/>
-        </w:rPr>
-        <w:t>factura.periode</w:t>
-      </w:r>
-      <w:proofErr w:type="spellEnd"/>
-      <w:r>
-        <w:rPr>
-          <w:rFonts w:ascii="Open Sans Light" w:eastAsia="Open Sans Light" w:hAnsi="Open Sans Light" w:cs="Open Sans Light"/>
-          <w:b/>
-          <w:sz w:val="20"/>
-          <w:szCs w:val="20"/>
-        </w:rPr>
-        <w:t>}}:</w:t>
+          <w:sz w:val="20"/>
+          <w:szCs w:val="20"/>
+        </w:rPr>
+        <w:t>}}</w:t>
       </w:r>
     </w:p>
     <w:p>
@@ -1940,32 +2071,8 @@
           <w:szCs w:val="20"/>
         </w:rPr>
       </w:pPr>
-      <w:r>
-        <w:rPr>
-          <w:rFonts w:ascii="Open Sans Light" w:eastAsia="Open Sans Light" w:hAnsi="Open Sans Light" w:cs="Open Sans Light"/>
-          <w:sz w:val="20"/>
-          <w:szCs w:val="20"/>
-        </w:rPr>
-        <w:t>{{$</w:t>
-      </w:r>
-      <w:proofErr w:type="spellStart"/>
-      <w:r>
-        <w:rPr>
-          <w:rFonts w:ascii="Open Sans Light" w:eastAsia="Open Sans Light" w:hAnsi="Open Sans Light" w:cs="Open Sans Light"/>
-          <w:sz w:val="20"/>
-          <w:szCs w:val="20"/>
-        </w:rPr>
-        <w:t>factura.record.justificacio_preu</w:t>
-      </w:r>
-      <w:proofErr w:type="spellEnd"/>
-      <w:r>
-        <w:rPr>
-          <w:rFonts w:ascii="Open Sans Light" w:eastAsia="Open Sans Light" w:hAnsi="Open Sans Light" w:cs="Open Sans Light"/>
-          <w:sz w:val="20"/>
-          <w:szCs w:val="20"/>
-        </w:rPr>
-        <w:t>}}</w:t>
-      </w:r>
+      <w:bookmarkStart w:id="0" w:name="_GoBack"/>
+      <w:bookmarkEnd w:id="0"/>
     </w:p>
     <w:p>
       <w:pPr>
@@ -1988,25 +2095,143 @@
           <w:sz w:val="20"/>
           <w:szCs w:val="20"/>
         </w:rPr>
-        <w:t>{{$</w:t>
-      </w:r>
-      <w:proofErr w:type="spellStart"/>
-      <w:r>
-        <w:rPr>
-          <w:rFonts w:ascii="Open Sans Light" w:eastAsia="Open Sans Light" w:hAnsi="Open Sans Light" w:cs="Open Sans Light"/>
-          <w:sz w:val="20"/>
-          <w:szCs w:val="20"/>
-        </w:rPr>
-        <w:t>factura.record.explicacio_preu</w:t>
-      </w:r>
-      <w:proofErr w:type="spellEnd"/>
-      <w:r>
-        <w:rPr>
-          <w:rFonts w:ascii="Open Sans Light" w:eastAsia="Open Sans Light" w:hAnsi="Open Sans Light" w:cs="Open Sans Light"/>
-          <w:sz w:val="20"/>
-          <w:szCs w:val="20"/>
-        </w:rPr>
-        <w:t>}}</w:t>
+        <w:t>{{END-FOR factura}}</w:t>
+      </w:r>
+    </w:p>
+    <w:p>
+      <w:r>
+        <w:rPr>
+          <w:rFonts w:ascii="Open Sans Light" w:eastAsia="Open Sans Light" w:hAnsi="Open Sans Light" w:cs="Open Sans Light"/>
+          <w:sz w:val="20"/>
+          <w:szCs w:val="20"/>
+        </w:rPr>
+        <w:t>{{END-IF}}</w:t>
+      </w:r>
+    </w:p>
+    <w:p>
+      <w:pPr>
+        <w:pStyle w:val="paragraph"/>
+        <w:spacing w:before="0" w:beforeAutospacing="0" w:after="0" w:afterAutospacing="0"/>
+        <w:ind w:left="720"/>
+        <w:textAlignment w:val="baseline"/>
+        <w:rPr>
+          <w:rFonts w:ascii="Segoe UI" w:hAnsi="Segoe UI" w:cs="Segoe UI"/>
+          <w:sz w:val="18"/>
+          <w:szCs w:val="18"/>
+        </w:rPr>
+      </w:pPr>
+      <w:r>
+        <w:rPr>
+          <w:rStyle w:val="eop"/>
+          <w:rFonts w:ascii="Open Sans Light" w:hAnsi="Open Sans Light" w:cs="Open Sans Light"/>
+          <w:sz w:val="20"/>
+          <w:szCs w:val="20"/>
+        </w:rPr>
+        <w:t> </w:t>
+      </w:r>
+    </w:p>
+    <w:p>
+      <w:r>
+        <w:rPr>
+          <w:rFonts w:ascii="Open Sans Light" w:eastAsia="Open Sans Light" w:hAnsi="Open Sans Light" w:cs="Open Sans Light"/>
+          <w:sz w:val="20"/>
+          <w:szCs w:val="20"/>
+        </w:rPr>
+        <w:t>{{IF factures_preu_b.length}}</w:t>
+      </w:r>
+    </w:p>
+    <w:p>
+      <w:pPr>
+        <w:pStyle w:val="paragraph"/>
+        <w:numPr>
+          <w:ilvl w:val="0"/>
+          <w:numId w:val="33"/>
+        </w:numPr>
+        <w:spacing w:before="0" w:beforeAutospacing="0" w:after="0" w:afterAutospacing="0"/>
+        <w:ind w:left="0" w:firstLine="720"/>
+        <w:textAlignment w:val="baseline"/>
+        <w:rPr>
+          <w:rStyle w:val="normaltextrun"/>
+          <w:rFonts w:ascii="Open Sans Light" w:hAnsi="Open Sans Light" w:cs="Open Sans Light"/>
+          <w:sz w:val="21"/>
+          <w:szCs w:val="21"/>
+        </w:rPr>
+      </w:pPr>
+      <w:r>
+        <w:rPr>
+          <w:rStyle w:val="normaltextrun"/>
+          <w:rFonts w:ascii="Open Sans Light" w:hAnsi="Open Sans Light" w:cs="Open Sans Light"/>
+          <w:sz w:val="20"/>
+          <w:szCs w:val="20"/>
+          <w:shd w:val="clear" w:color="auto" w:fill="FFFFFF"/>
+          <w:lang w:val="ca-ES"/>
+        </w:rPr>
+        <w:t>El/la tècnic/a responsable de la despesa</w:t>
+      </w:r>
+      <w:r>
+        <w:rPr>
+          <w:rStyle w:val="normaltextrun"/>
+          <w:rFonts w:ascii="Open Sans Light" w:hAnsi="Open Sans Light" w:cs="Open Sans Light"/>
+          <w:sz w:val="20"/>
+          <w:szCs w:val="20"/>
+          <w:shd w:val="clear" w:color="auto" w:fill="FFFFFF"/>
+          <w:lang w:val="ca-ES"/>
+        </w:rPr>
+        <w:t xml:space="preserve"> </w:t>
+      </w:r>
+      <w:r>
+        <w:rPr>
+          <w:rStyle w:val="normaltextrun"/>
+          <w:rFonts w:ascii="Open Sans Light" w:hAnsi="Open Sans Light" w:cs="Open Sans Light"/>
+          <w:sz w:val="20"/>
+          <w:szCs w:val="20"/>
+          <w:shd w:val="clear" w:color="auto" w:fill="FFFFFF"/>
+          <w:lang w:val="ca-ES"/>
+        </w:rPr>
+        <w:t>ha realitzat consultes al mercat i ha emès l’informe econòmic que s’adjunta, que justifica que els preus aplicats s’ajusten al mercat</w:t>
+      </w:r>
+      <w:r>
+        <w:rPr>
+          <w:rStyle w:val="normaltextrun"/>
+          <w:rFonts w:ascii="Open Sans Light" w:hAnsi="Open Sans Light" w:cs="Open Sans Light"/>
+          <w:sz w:val="20"/>
+          <w:szCs w:val="20"/>
+          <w:shd w:val="clear" w:color="auto" w:fill="FFFFFF"/>
+          <w:lang w:val="ca-ES"/>
+        </w:rPr>
+        <w:t>:</w:t>
+      </w:r>
+    </w:p>
+    <w:p>
+      <w:pPr>
+        <w:pStyle w:val="paragraph"/>
+        <w:spacing w:before="0" w:beforeAutospacing="0" w:after="0" w:afterAutospacing="0"/>
+        <w:textAlignment w:val="baseline"/>
+        <w:rPr>
+          <w:rStyle w:val="normaltextrun"/>
+          <w:rFonts w:ascii="Open Sans Light" w:hAnsi="Open Sans Light" w:cs="Open Sans Light"/>
+          <w:sz w:val="20"/>
+          <w:szCs w:val="20"/>
+          <w:shd w:val="clear" w:color="auto" w:fill="FFFFFF"/>
+          <w:lang w:val="ca-ES"/>
+        </w:rPr>
+      </w:pPr>
+    </w:p>
+    <w:p>
+      <w:pPr>
+        <w:rPr>
+          <w:rFonts w:ascii="Open Sans Light" w:hAnsi="Open Sans Light" w:cs="Open Sans Light"/>
+          <w:sz w:val="20"/>
+          <w:szCs w:val="20"/>
+        </w:rPr>
+      </w:pPr>
+      <w:r>
+        <w:rPr>
+          <w:rFonts w:ascii="Open Sans Light" w:hAnsi="Open Sans Light" w:cs="Open Sans Light"/>
+          <w:sz w:val="20"/>
+          <w:szCs w:val="20"/>
+        </w:rPr>
+        <w:t>{{FOR factura IN factures_preu_b}}</w:t>
       </w:r>
     </w:p>
     <w:p>
@@ -2020,10 +2245,60 @@
         <w:spacing w:before="120" w:line="276" w:lineRule="auto"/>
         <w:rPr>
           <w:rFonts w:ascii="Open Sans Light" w:eastAsia="Open Sans Light" w:hAnsi="Open Sans Light" w:cs="Open Sans Light"/>
-          <w:sz w:val="20"/>
-          <w:szCs w:val="20"/>
-        </w:rPr>
-      </w:pPr>
+          <w:b/>
+          <w:sz w:val="20"/>
+          <w:szCs w:val="20"/>
+        </w:rPr>
+      </w:pPr>
+      <w:r>
+        <w:rPr>
+          <w:rFonts w:ascii="Open Sans Light" w:eastAsia="Open Sans Light" w:hAnsi="Open Sans Light" w:cs="Open Sans Light"/>
+          <w:b/>
+          <w:sz w:val="20"/>
+          <w:szCs w:val="20"/>
+        </w:rPr>
+        <w:t>{{$</w:t>
+      </w:r>
+      <w:proofErr w:type="spellStart"/>
+      <w:r>
+        <w:rPr>
+          <w:rFonts w:ascii="Open Sans Light" w:eastAsia="Open Sans Light" w:hAnsi="Open Sans Light" w:cs="Open Sans Light"/>
+          <w:b/>
+          <w:sz w:val="20"/>
+          <w:szCs w:val="20"/>
+        </w:rPr>
+        <w:t>factura.descripcio</w:t>
+      </w:r>
+      <w:proofErr w:type="spellEnd"/>
+      <w:r>
+        <w:rPr>
+          <w:rFonts w:ascii="Open Sans Light" w:eastAsia="Open Sans Light" w:hAnsi="Open Sans Light" w:cs="Open Sans Light"/>
+          <w:b/>
+          <w:sz w:val="20"/>
+          <w:szCs w:val="20"/>
+        </w:rPr>
+        <w:t>}} - {{$</w:t>
+      </w:r>
+      <w:proofErr w:type="spellStart"/>
+      <w:r>
+        <w:rPr>
+          <w:rFonts w:ascii="Open Sans Light" w:eastAsia="Open Sans Light" w:hAnsi="Open Sans Light" w:cs="Open Sans Light"/>
+          <w:b/>
+          <w:sz w:val="20"/>
+          <w:szCs w:val="20"/>
+        </w:rPr>
+        <w:t>factura.periode</w:t>
+      </w:r>
+      <w:proofErr w:type="spellEnd"/>
+      <w:r>
+        <w:rPr>
+          <w:rFonts w:ascii="Open Sans Light" w:eastAsia="Open Sans Light" w:hAnsi="Open Sans Light" w:cs="Open Sans Light"/>
+          <w:b/>
+          <w:sz w:val="20"/>
+          <w:szCs w:val="20"/>
+        </w:rPr>
+        <w:t>}}:</w:t>
+      </w:r>
     </w:p>
     <w:p>
       <w:pPr>
@@ -2046,19 +2321,338 @@
           <w:sz w:val="20"/>
           <w:szCs w:val="20"/>
         </w:rPr>
+        <w:t>{{$</w:t>
+      </w:r>
+      <w:proofErr w:type="spellStart"/>
+      <w:r>
+        <w:rPr>
+          <w:rFonts w:ascii="Open Sans Light" w:eastAsia="Open Sans Light" w:hAnsi="Open Sans Light" w:cs="Open Sans Light"/>
+          <w:sz w:val="20"/>
+          <w:szCs w:val="20"/>
+        </w:rPr>
+        <w:t>factura.record.explicacio_preu</w:t>
+      </w:r>
+      <w:proofErr w:type="spellEnd"/>
+      <w:r>
+        <w:rPr>
+          <w:rFonts w:ascii="Open Sans Light" w:eastAsia="Open Sans Light" w:hAnsi="Open Sans Light" w:cs="Open Sans Light"/>
+          <w:sz w:val="20"/>
+          <w:szCs w:val="20"/>
+        </w:rPr>
+        <w:t>}}</w:t>
+      </w:r>
+    </w:p>
+    <w:p>
+      <w:pPr>
+        <w:keepLines/>
+        <w:widowControl w:val="0"/>
+        <w:tabs>
+          <w:tab w:val="left" w:pos="395"/>
+        </w:tabs>
+        <w:suppressAutoHyphens w:val="0"/>
+        <w:spacing w:before="120" w:line="276" w:lineRule="auto"/>
+        <w:rPr>
+          <w:rFonts w:ascii="Open Sans Light" w:eastAsia="Open Sans Light" w:hAnsi="Open Sans Light" w:cs="Open Sans Light"/>
+          <w:sz w:val="20"/>
+          <w:szCs w:val="20"/>
+        </w:rPr>
+      </w:pPr>
+    </w:p>
+    <w:p>
+      <w:pPr>
+        <w:keepLines/>
+        <w:widowControl w:val="0"/>
+        <w:tabs>
+          <w:tab w:val="left" w:pos="395"/>
+        </w:tabs>
+        <w:suppressAutoHyphens w:val="0"/>
+        <w:spacing w:before="120" w:line="276" w:lineRule="auto"/>
+        <w:rPr>
+          <w:rFonts w:ascii="Open Sans Light" w:eastAsia="Open Sans Light" w:hAnsi="Open Sans Light" w:cs="Open Sans Light"/>
+          <w:sz w:val="20"/>
+          <w:szCs w:val="20"/>
+        </w:rPr>
+      </w:pPr>
+      <w:r>
+        <w:rPr>
+          <w:rFonts w:ascii="Open Sans Light" w:eastAsia="Open Sans Light" w:hAnsi="Open Sans Light" w:cs="Open Sans Light"/>
+          <w:sz w:val="20"/>
+          <w:szCs w:val="20"/>
+        </w:rPr>
         <w:t>{{END-FOR factura}}</w:t>
       </w:r>
     </w:p>
     <w:p>
       <w:pPr>
+        <w:pStyle w:val="paragraph"/>
+        <w:spacing w:before="0" w:beforeAutospacing="0" w:after="0" w:afterAutospacing="0"/>
+        <w:textAlignment w:val="baseline"/>
+        <w:rPr>
+          <w:rFonts w:ascii="Segoe UI" w:hAnsi="Segoe UI" w:cs="Segoe UI"/>
+          <w:sz w:val="18"/>
+          <w:szCs w:val="18"/>
+        </w:rPr>
+      </w:pPr>
+    </w:p>
+    <w:p>
+      <w:r>
+        <w:rPr>
+          <w:rFonts w:ascii="Open Sans Light" w:eastAsia="Open Sans Light" w:hAnsi="Open Sans Light" w:cs="Open Sans Light"/>
+          <w:sz w:val="20"/>
+          <w:szCs w:val="20"/>
+        </w:rPr>
+        <w:t>{{END-IF}}</w:t>
+      </w:r>
+    </w:p>
+    <w:p>
+      <w:r>
+        <w:rPr>
+          <w:rFonts w:ascii="Open Sans Light" w:eastAsia="Open Sans Light" w:hAnsi="Open Sans Light" w:cs="Open Sans Light"/>
+          <w:sz w:val="20"/>
+          <w:szCs w:val="20"/>
+        </w:rPr>
+        <w:t>{{IF factures_preu_c.length}}</w:t>
+      </w:r>
+    </w:p>
+    <w:p>
+      <w:pPr>
+        <w:pStyle w:val="paragraph"/>
+        <w:numPr>
+          <w:ilvl w:val="0"/>
+          <w:numId w:val="34"/>
+        </w:numPr>
+        <w:spacing w:before="0" w:beforeAutospacing="0" w:after="0" w:afterAutospacing="0"/>
+        <w:ind w:left="0" w:firstLine="720"/>
+        <w:textAlignment w:val="baseline"/>
+        <w:rPr>
+          <w:rStyle w:val="normaltextrun"/>
+          <w:rFonts w:ascii="Open Sans Light" w:hAnsi="Open Sans Light" w:cs="Open Sans Light"/>
+          <w:sz w:val="21"/>
+          <w:szCs w:val="21"/>
+        </w:rPr>
+      </w:pPr>
+      <w:r>
+        <w:rPr>
+          <w:rStyle w:val="normaltextrun"/>
+          <w:rFonts w:ascii="Open Sans Light" w:hAnsi="Open Sans Light" w:cs="Open Sans Light"/>
+          <w:sz w:val="20"/>
+          <w:szCs w:val="20"/>
+          <w:shd w:val="clear" w:color="auto" w:fill="FFFFFF"/>
+          <w:lang w:val="ca-ES"/>
+        </w:rPr>
+        <w:t>Els preus facturats es mantenen en les mateixes condicions que es venien aplicant durant la duració del contracte anterior</w:t>
+      </w:r>
+      <w:r>
+        <w:rPr>
+          <w:rStyle w:val="normaltextrun"/>
+          <w:rFonts w:ascii="Open Sans Light" w:hAnsi="Open Sans Light" w:cs="Open Sans Light"/>
+          <w:sz w:val="20"/>
+          <w:szCs w:val="20"/>
+          <w:shd w:val="clear" w:color="auto" w:fill="FFFFFF"/>
+          <w:lang w:val="ca-ES"/>
+        </w:rPr>
+        <w:t>:</w:t>
+      </w:r>
+    </w:p>
+    <w:p>
+      <w:pPr>
+        <w:pStyle w:val="paragraph"/>
+        <w:spacing w:before="0" w:beforeAutospacing="0" w:after="0" w:afterAutospacing="0"/>
+        <w:textAlignment w:val="baseline"/>
+        <w:rPr>
+          <w:rStyle w:val="normaltextrun"/>
+          <w:rFonts w:ascii="Open Sans Light" w:hAnsi="Open Sans Light" w:cs="Open Sans Light"/>
+          <w:sz w:val="20"/>
+          <w:szCs w:val="20"/>
+          <w:shd w:val="clear" w:color="auto" w:fill="FFFFFF"/>
+          <w:lang w:val="ca-ES"/>
+        </w:rPr>
+      </w:pPr>
+    </w:p>
+    <w:p>
+      <w:pPr>
+        <w:rPr>
+          <w:rFonts w:ascii="Open Sans Light" w:hAnsi="Open Sans Light" w:cs="Open Sans Light"/>
+          <w:sz w:val="20"/>
+          <w:szCs w:val="20"/>
+        </w:rPr>
+      </w:pPr>
+      <w:r>
+        <w:rPr>
+          <w:rFonts w:ascii="Open Sans Light" w:hAnsi="Open Sans Light" w:cs="Open Sans Light"/>
+          <w:sz w:val="20"/>
+          <w:szCs w:val="20"/>
+        </w:rPr>
+        <w:t>{{FOR factura IN factures_preu_c}}</w:t>
+      </w:r>
+    </w:p>
+    <w:p>
+      <w:pPr>
+        <w:keepLines/>
+        <w:widowControl w:val="0"/>
+        <w:tabs>
+          <w:tab w:val="left" w:pos="395"/>
+        </w:tabs>
+        <w:suppressAutoHyphens w:val="0"/>
+        <w:spacing w:before="120" w:line="276" w:lineRule="auto"/>
+        <w:rPr>
+          <w:rFonts w:ascii="Open Sans Light" w:eastAsia="Open Sans Light" w:hAnsi="Open Sans Light" w:cs="Open Sans Light"/>
+          <w:b/>
+          <w:sz w:val="20"/>
+          <w:szCs w:val="20"/>
+        </w:rPr>
+      </w:pPr>
+      <w:r>
+        <w:rPr>
+          <w:rFonts w:ascii="Open Sans Light" w:eastAsia="Open Sans Light" w:hAnsi="Open Sans Light" w:cs="Open Sans Light"/>
+          <w:b/>
+          <w:sz w:val="20"/>
+          <w:szCs w:val="20"/>
+        </w:rPr>
+        <w:t>{{$</w:t>
+      </w:r>
+      <w:proofErr w:type="spellStart"/>
+      <w:r>
+        <w:rPr>
+          <w:rFonts w:ascii="Open Sans Light" w:eastAsia="Open Sans Light" w:hAnsi="Open Sans Light" w:cs="Open Sans Light"/>
+          <w:b/>
+          <w:sz w:val="20"/>
+          <w:szCs w:val="20"/>
+        </w:rPr>
+        <w:t>factura.descripcio</w:t>
+      </w:r>
+      <w:proofErr w:type="spellEnd"/>
+      <w:r>
+        <w:rPr>
+          <w:rFonts w:ascii="Open Sans Light" w:eastAsia="Open Sans Light" w:hAnsi="Open Sans Light" w:cs="Open Sans Light"/>
+          <w:b/>
+          <w:sz w:val="20"/>
+          <w:szCs w:val="20"/>
+        </w:rPr>
+        <w:t>}} - {{$</w:t>
+      </w:r>
+      <w:proofErr w:type="spellStart"/>
+      <w:r>
+        <w:rPr>
+          <w:rFonts w:ascii="Open Sans Light" w:eastAsia="Open Sans Light" w:hAnsi="Open Sans Light" w:cs="Open Sans Light"/>
+          <w:b/>
+          <w:sz w:val="20"/>
+          <w:szCs w:val="20"/>
+        </w:rPr>
+        <w:t>factura.periode</w:t>
+      </w:r>
+      <w:proofErr w:type="spellEnd"/>
+      <w:r>
+        <w:rPr>
+          <w:rFonts w:ascii="Open Sans Light" w:eastAsia="Open Sans Light" w:hAnsi="Open Sans Light" w:cs="Open Sans Light"/>
+          <w:b/>
+          <w:sz w:val="20"/>
+          <w:szCs w:val="20"/>
+        </w:rPr>
+        <w:t>}}:</w:t>
+      </w:r>
+    </w:p>
+    <w:p>
+      <w:pPr>
+        <w:keepLines/>
+        <w:widowControl w:val="0"/>
+        <w:tabs>
+          <w:tab w:val="left" w:pos="395"/>
+        </w:tabs>
+        <w:suppressAutoHyphens w:val="0"/>
+        <w:spacing w:before="120" w:line="276" w:lineRule="auto"/>
+        <w:rPr>
+          <w:rFonts w:ascii="Open Sans Light" w:eastAsia="Open Sans Light" w:hAnsi="Open Sans Light" w:cs="Open Sans Light"/>
+          <w:sz w:val="20"/>
+          <w:szCs w:val="20"/>
+        </w:rPr>
+      </w:pPr>
+      <w:r>
+        <w:rPr>
+          <w:rFonts w:ascii="Open Sans Light" w:eastAsia="Open Sans Light" w:hAnsi="Open Sans Light" w:cs="Open Sans Light"/>
+          <w:sz w:val="20"/>
+          <w:szCs w:val="20"/>
+        </w:rPr>
+        <w:t>{{$</w:t>
+      </w:r>
+      <w:proofErr w:type="spellStart"/>
+      <w:r>
+        <w:rPr>
+          <w:rFonts w:ascii="Open Sans Light" w:eastAsia="Open Sans Light" w:hAnsi="Open Sans Light" w:cs="Open Sans Light"/>
+          <w:sz w:val="20"/>
+          <w:szCs w:val="20"/>
+        </w:rPr>
+        <w:t>factura.record.explicacio_preu</w:t>
+      </w:r>
+      <w:proofErr w:type="spellEnd"/>
+      <w:r>
+        <w:rPr>
+          <w:rFonts w:ascii="Open Sans Light" w:eastAsia="Open Sans Light" w:hAnsi="Open Sans Light" w:cs="Open Sans Light"/>
+          <w:sz w:val="20"/>
+          <w:szCs w:val="20"/>
+        </w:rPr>
+        <w:t>}}</w:t>
+      </w:r>
+    </w:p>
+    <w:p>
+      <w:pPr>
+        <w:keepLines/>
+        <w:widowControl w:val="0"/>
+        <w:tabs>
+          <w:tab w:val="left" w:pos="395"/>
+        </w:tabs>
+        <w:suppressAutoHyphens w:val="0"/>
+        <w:spacing w:before="120" w:line="276" w:lineRule="auto"/>
+        <w:rPr>
+          <w:rFonts w:ascii="Open Sans Light" w:eastAsia="Open Sans Light" w:hAnsi="Open Sans Light" w:cs="Open Sans Light"/>
+          <w:sz w:val="20"/>
+          <w:szCs w:val="20"/>
+        </w:rPr>
+      </w:pPr>
+    </w:p>
+    <w:p>
+      <w:pPr>
+        <w:keepLines/>
+        <w:widowControl w:val="0"/>
+        <w:tabs>
+          <w:tab w:val="left" w:pos="395"/>
+        </w:tabs>
+        <w:suppressAutoHyphens w:val="0"/>
+        <w:spacing w:before="120" w:line="276" w:lineRule="auto"/>
+        <w:rPr>
+          <w:rFonts w:ascii="Open Sans Light" w:eastAsia="Open Sans Light" w:hAnsi="Open Sans Light" w:cs="Open Sans Light"/>
+          <w:sz w:val="20"/>
+          <w:szCs w:val="20"/>
+        </w:rPr>
+      </w:pPr>
+      <w:r>
+        <w:rPr>
+          <w:rFonts w:ascii="Open Sans Light" w:eastAsia="Open Sans Light" w:hAnsi="Open Sans Light" w:cs="Open Sans Light"/>
+          <w:sz w:val="20"/>
+          <w:szCs w:val="20"/>
+        </w:rPr>
+        <w:t>{{END-FOR factura}}</w:t>
+      </w:r>
+    </w:p>
+    <w:p>
+      <w:pPr>
         <w:jc w:val="both"/>
         <w:rPr>
           <w:rFonts w:ascii="Open Sans Light" w:hAnsi="Open Sans Light" w:cs="Open Sans Light"/>
-          <w:b/>
-          <w:sz w:val="20"/>
-          <w:szCs w:val="20"/>
-        </w:rPr>
-      </w:pPr>
+          <w:sz w:val="20"/>
+          <w:szCs w:val="20"/>
+        </w:rPr>
+      </w:pPr>
+    </w:p>
+    <w:p>
+      <w:r>
+        <w:rPr>
+          <w:rFonts w:ascii="Open Sans Light" w:eastAsia="Open Sans Light" w:hAnsi="Open Sans Light" w:cs="Open Sans Light"/>
+          <w:sz w:val="20"/>
+          <w:szCs w:val="20"/>
+        </w:rPr>
+        <w:t>{{END-IF}}</w:t>
+      </w:r>
     </w:p>
     <w:p>
       <w:pPr>
@@ -2234,7 +2828,18 @@
           <w:szCs w:val="20"/>
           <w:lang w:val="ca-ES"/>
         </w:rPr>
-        <w:t>Per finalització de contractes administratius i les corresponents prorrogues en el seu cas, i no haver iniciat nova licitació o bé tot i haver sortit a licitació encara no s’ha adjudicat el nou contracte administratiu. Tot i haver-hi contracte l’objecte de la factura no es troba englobat dins el mateix.</w:t>
+        <w:t xml:space="preserve">Per finalització de contractes administratius i les corresponents prorrogues en el seu cas, i no haver iniciat nova licitació o bé tot i haver sortit a licitació encara no s’ha adjudicat </w:t>
+      </w:r>
+      <w:r>
+        <w:rPr>
+          <w:rStyle w:val="normaltextrun"/>
+          <w:rFonts w:ascii="Open Sans Light" w:hAnsi="Open Sans Light" w:cs="Open Sans Light"/>
+          <w:sz w:val="20"/>
+          <w:szCs w:val="20"/>
+          <w:lang w:val="ca-ES"/>
+        </w:rPr>
+        <w:lastRenderedPageBreak/>
+        <w:t>el nou contracte administratiu. Tot i haver-hi contracte l’objecte de la factura no es troba englobat dins el mateix.</w:t>
       </w:r>
       <w:r>
         <w:rPr>
@@ -2702,7 +3307,6 @@
           <w:szCs w:val="20"/>
           <w:lang w:val="ca-ES"/>
         </w:rPr>
-        <w:lastRenderedPageBreak/>
         <w:t>Tot i haver sortit a licitació un nou contracte administratiu, la adjudicació ha resultat deserta.</w:t>
       </w:r>
       <w:r>
@@ -2729,8 +3333,6 @@
           <w:szCs w:val="20"/>
         </w:rPr>
       </w:pPr>
-      <w:bookmarkStart w:id="0" w:name="_GoBack"/>
-      <w:bookmarkEnd w:id="0"/>
     </w:p>
     <w:p>
       <w:pPr>
@@ -3204,6 +3806,7 @@
           <w:szCs w:val="20"/>
           <w:lang w:val="ca-ES"/>
         </w:rPr>
+        <w:lastRenderedPageBreak/>
         <w:t>Manca de personal al centre que dificulta la planificació de la contractació i realitzar propostes des d’altres enfocaments i perspectives als problemes que la contractació d’avui demanda. </w:t>
       </w:r>
       <w:r>
@@ -3967,7 +4570,16 @@
           <w:sz w:val="20"/>
           <w:szCs w:val="20"/>
         </w:rPr>
-        <w:t>D’acord amb la informació d’execució pressupostària, existeix crèdit per imputar la despesa derivada de les prestacions realitzades i, vistes les necessitats i atencions de l’aplicació durant tot l’exercici, no s’aprecia impediment o limitació a la imputació de la despesa al pressupost de l’exercici corrent. </w:t>
+        <w:t xml:space="preserve">D’acord amb la informació d’execució pressupostària, existeix crèdit per imputar la despesa derivada de les prestacions realitzades i, vistes les necessitats i atencions de </w:t>
+      </w:r>
+      <w:r>
+        <w:rPr>
+          <w:rFonts w:ascii="Open Sans Light" w:hAnsi="Open Sans Light" w:cs="Open Sans Light"/>
+          <w:sz w:val="20"/>
+          <w:szCs w:val="20"/>
+        </w:rPr>
+        <w:lastRenderedPageBreak/>
+        <w:t>l’aplicació durant tot l’exercici, no s’aprecia impediment o limitació a la imputació de la despesa al pressupost de l’exercici corrent. </w:t>
       </w:r>
     </w:p>
     <w:p>
@@ -4112,16 +4724,7 @@
           <w:sz w:val="20"/>
           <w:szCs w:val="20"/>
         </w:rPr>
-        <w:t xml:space="preserve">La taxació dels costs que correspon abonar als tercers interessats en concepte d’indemnització substitutiva, exclusivament pel valor de les despeses ocasionades per la realització de la </w:t>
-      </w:r>
-      <w:r>
-        <w:rPr>
-          <w:rFonts w:ascii="Open Sans Light" w:hAnsi="Open Sans Light" w:cs="Open Sans Light"/>
-          <w:sz w:val="20"/>
-          <w:szCs w:val="20"/>
-        </w:rPr>
-        <w:lastRenderedPageBreak/>
-        <w:t>prestació és de </w:t>
+        <w:t>La taxació dels costs que correspon abonar als tercers interessats en concepte d’indemnització substitutiva, exclusivament pel valor de les despeses ocasionades per la realització de la prestació és de </w:t>
       </w:r>
       <w:r>
         <w:rPr>
@@ -6870,7 +7473,7 @@
         <w:sz w:val="20"/>
         <w:szCs w:val="20"/>
       </w:rPr>
-      <w:t>5</w:t>
+      <w:t>6</w:t>
     </w:r>
     <w:r>
       <w:rPr>
@@ -7409,6 +8012,119 @@
     </w:lvl>
   </w:abstractNum>
   <w:abstractNum w:abstractNumId="2" w15:restartNumberingAfterBreak="0">
+    <w:nsid w:val="06F46A86"/>
+    <w:multiLevelType w:val="multilevel"/>
+    <w:tmpl w:val="AABA203C"/>
+    <w:lvl w:ilvl="0">
+      <w:start w:val="2"/>
+      <w:numFmt w:val="lowerLetter"/>
+      <w:lvlText w:val="%1."/>
+      <w:lvlJc w:val="left"/>
+      <w:pPr>
+        <w:tabs>
+          <w:tab w:val="num" w:pos="720"/>
+        </w:tabs>
+        <w:ind w:left="720" w:hanging="360"/>
+      </w:pPr>
+    </w:lvl>
+    <w:lvl w:ilvl="1" w:tentative="1">
+      <w:start w:val="1"/>
+      <w:numFmt w:val="lowerLetter"/>
+      <w:lvlText w:val="%2."/>
+      <w:lvlJc w:val="left"/>
+      <w:pPr>
+        <w:tabs>
+          <w:tab w:val="num" w:pos="1440"/>
+        </w:tabs>
+        <w:ind w:left="1440" w:hanging="360"/>
+      </w:pPr>
+    </w:lvl>
+    <w:lvl w:ilvl="2" w:tentative="1">
+      <w:start w:val="1"/>
+      <w:numFmt w:val="lowerLetter"/>
+      <w:lvlText w:val="%3."/>
+      <w:lvlJc w:val="left"/>
+      <w:pPr>
+        <w:tabs>
+          <w:tab w:val="num" w:pos="2160"/>
+        </w:tabs>
+        <w:ind w:left="2160" w:hanging="360"/>
+      </w:pPr>
+    </w:lvl>
+    <w:lvl w:ilvl="3" w:tentative="1">
+      <w:start w:val="1"/>
+      <w:numFmt w:val="lowerLetter"/>
+      <w:lvlText w:val="%4."/>
+      <w:lvlJc w:val="left"/>
+      <w:pPr>
+        <w:tabs>
+          <w:tab w:val="num" w:pos="2880"/>
+        </w:tabs>
+        <w:ind w:left="2880" w:hanging="360"/>
+      </w:pPr>
+    </w:lvl>
+    <w:lvl w:ilvl="4" w:tentative="1">
+      <w:start w:val="1"/>
+      <w:numFmt w:val="lowerLetter"/>
+      <w:lvlText w:val="%5."/>
+      <w:lvlJc w:val="left"/>
+      <w:pPr>
+        <w:tabs>
+          <w:tab w:val="num" w:pos="3600"/>
+        </w:tabs>
+        <w:ind w:left="3600" w:hanging="360"/>
+      </w:pPr>
+    </w:lvl>
+    <w:lvl w:ilvl="5" w:tentative="1">
+      <w:start w:val="1"/>
+      <w:numFmt w:val="lowerLetter"/>
+      <w:lvlText w:val="%6."/>
+      <w:lvlJc w:val="left"/>
+      <w:pPr>
+        <w:tabs>
+          <w:tab w:val="num" w:pos="4320"/>
+        </w:tabs>
+        <w:ind w:left="4320" w:hanging="360"/>
+      </w:pPr>
+    </w:lvl>
+    <w:lvl w:ilvl="6" w:tentative="1">
+      <w:start w:val="1"/>
+      <w:numFmt w:val="lowerLetter"/>
+      <w:lvlText w:val="%7."/>
+      <w:lvlJc w:val="left"/>
+      <w:pPr>
+        <w:tabs>
+          <w:tab w:val="num" w:pos="5040"/>
+        </w:tabs>
+        <w:ind w:left="5040" w:hanging="360"/>
+      </w:pPr>
+    </w:lvl>
+    <w:lvl w:ilvl="7" w:tentative="1">
+      <w:start w:val="1"/>
+      <w:numFmt w:val="lowerLetter"/>
+      <w:lvlText w:val="%8."/>
+      <w:lvlJc w:val="left"/>
+      <w:pPr>
+        <w:tabs>
+          <w:tab w:val="num" w:pos="5760"/>
+        </w:tabs>
+        <w:ind w:left="5760" w:hanging="360"/>
+      </w:pPr>
+    </w:lvl>
+    <w:lvl w:ilvl="8" w:tentative="1">
+      <w:start w:val="1"/>
+      <w:numFmt w:val="lowerLetter"/>
+      <w:lvlText w:val="%9."/>
+      <w:lvlJc w:val="left"/>
+      <w:pPr>
+        <w:tabs>
+          <w:tab w:val="num" w:pos="6480"/>
+        </w:tabs>
+        <w:ind w:left="6480" w:hanging="360"/>
+      </w:pPr>
+    </w:lvl>
+  </w:abstractNum>
+  <w:abstractNum w:abstractNumId="3" w15:restartNumberingAfterBreak="0">
     <w:nsid w:val="1245156C"/>
     <w:multiLevelType w:val="multilevel"/>
     <w:tmpl w:val="05CE2382"/>
@@ -7521,7 +8237,7 @@
       </w:pPr>
     </w:lvl>
   </w:abstractNum>
-  <w:abstractNum w:abstractNumId="3" w15:restartNumberingAfterBreak="0">
+  <w:abstractNum w:abstractNumId="4" w15:restartNumberingAfterBreak="0">
     <w:nsid w:val="12AFC7B2"/>
     <w:multiLevelType w:val="multilevel"/>
     <w:tmpl w:val="8954F6C6"/>
@@ -7697,7 +8413,7 @@
       </w:rPr>
     </w:lvl>
   </w:abstractNum>
-  <w:abstractNum w:abstractNumId="4" w15:restartNumberingAfterBreak="0">
+  <w:abstractNum w:abstractNumId="5" w15:restartNumberingAfterBreak="0">
     <w:nsid w:val="12BB3710"/>
     <w:multiLevelType w:val="multilevel"/>
     <w:tmpl w:val="452E893E"/>
@@ -7810,7 +8526,7 @@
       </w:pPr>
     </w:lvl>
   </w:abstractNum>
-  <w:abstractNum w:abstractNumId="5" w15:restartNumberingAfterBreak="0">
+  <w:abstractNum w:abstractNumId="6" w15:restartNumberingAfterBreak="0">
     <w:nsid w:val="161E21AE"/>
     <w:multiLevelType w:val="multilevel"/>
     <w:tmpl w:val="A9B8A3DA"/>
@@ -7923,7 +8639,7 @@
       </w:pPr>
     </w:lvl>
   </w:abstractNum>
-  <w:abstractNum w:abstractNumId="6" w15:restartNumberingAfterBreak="0">
+  <w:abstractNum w:abstractNumId="7" w15:restartNumberingAfterBreak="0">
     <w:nsid w:val="220C17E7"/>
     <w:multiLevelType w:val="multilevel"/>
     <w:tmpl w:val="1214CD84"/>
@@ -8012,7 +8728,7 @@
       </w:pPr>
     </w:lvl>
   </w:abstractNum>
-  <w:abstractNum w:abstractNumId="7" w15:restartNumberingAfterBreak="0">
+  <w:abstractNum w:abstractNumId="8" w15:restartNumberingAfterBreak="0">
     <w:nsid w:val="227E7C15"/>
     <w:multiLevelType w:val="multilevel"/>
     <w:tmpl w:val="FF227A02"/>
@@ -8125,7 +8841,120 @@
       </w:pPr>
     </w:lvl>
   </w:abstractNum>
-  <w:abstractNum w:abstractNumId="8" w15:restartNumberingAfterBreak="0">
+  <w:abstractNum w:abstractNumId="9" w15:restartNumberingAfterBreak="0">
+    <w:nsid w:val="239952A5"/>
+    <w:multiLevelType w:val="multilevel"/>
+    <w:tmpl w:val="B5B6938A"/>
+    <w:lvl w:ilvl="0">
+      <w:start w:val="3"/>
+      <w:numFmt w:val="lowerLetter"/>
+      <w:lvlText w:val="%1."/>
+      <w:lvlJc w:val="left"/>
+      <w:pPr>
+        <w:tabs>
+          <w:tab w:val="num" w:pos="720"/>
+        </w:tabs>
+        <w:ind w:left="720" w:hanging="360"/>
+      </w:pPr>
+    </w:lvl>
+    <w:lvl w:ilvl="1" w:tentative="1">
+      <w:start w:val="1"/>
+      <w:numFmt w:val="lowerLetter"/>
+      <w:lvlText w:val="%2."/>
+      <w:lvlJc w:val="left"/>
+      <w:pPr>
+        <w:tabs>
+          <w:tab w:val="num" w:pos="1440"/>
+        </w:tabs>
+        <w:ind w:left="1440" w:hanging="360"/>
+      </w:pPr>
+    </w:lvl>
+    <w:lvl w:ilvl="2" w:tentative="1">
+      <w:start w:val="1"/>
+      <w:numFmt w:val="lowerLetter"/>
+      <w:lvlText w:val="%3."/>
+      <w:lvlJc w:val="left"/>
+      <w:pPr>
+        <w:tabs>
+          <w:tab w:val="num" w:pos="2160"/>
+        </w:tabs>
+        <w:ind w:left="2160" w:hanging="360"/>
+      </w:pPr>
+    </w:lvl>
+    <w:lvl w:ilvl="3" w:tentative="1">
+      <w:start w:val="1"/>
+      <w:numFmt w:val="lowerLetter"/>
+      <w:lvlText w:val="%4."/>
+      <w:lvlJc w:val="left"/>
+      <w:pPr>
+        <w:tabs>
+          <w:tab w:val="num" w:pos="2880"/>
+        </w:tabs>
+        <w:ind w:left="2880" w:hanging="360"/>
+      </w:pPr>
+    </w:lvl>
+    <w:lvl w:ilvl="4" w:tentative="1">
+      <w:start w:val="1"/>
+      <w:numFmt w:val="lowerLetter"/>
+      <w:lvlText w:val="%5."/>
+      <w:lvlJc w:val="left"/>
+      <w:pPr>
+        <w:tabs>
+          <w:tab w:val="num" w:pos="3600"/>
+        </w:tabs>
+        <w:ind w:left="3600" w:hanging="360"/>
+      </w:pPr>
+    </w:lvl>
+    <w:lvl w:ilvl="5" w:tentative="1">
+      <w:start w:val="1"/>
+      <w:numFmt w:val="lowerLetter"/>
+      <w:lvlText w:val="%6."/>
+      <w:lvlJc w:val="left"/>
+      <w:pPr>
+        <w:tabs>
+          <w:tab w:val="num" w:pos="4320"/>
+        </w:tabs>
+        <w:ind w:left="4320" w:hanging="360"/>
+      </w:pPr>
+    </w:lvl>
+    <w:lvl w:ilvl="6" w:tentative="1">
+      <w:start w:val="1"/>
+      <w:numFmt w:val="lowerLetter"/>
+      <w:lvlText w:val="%7."/>
+      <w:lvlJc w:val="left"/>
+      <w:pPr>
+        <w:tabs>
+          <w:tab w:val="num" w:pos="5040"/>
+        </w:tabs>
+        <w:ind w:left="5040" w:hanging="360"/>
+      </w:pPr>
+    </w:lvl>
+    <w:lvl w:ilvl="7" w:tentative="1">
+      <w:start w:val="1"/>
+      <w:numFmt w:val="lowerLetter"/>
+      <w:lvlText w:val="%8."/>
+      <w:lvlJc w:val="left"/>
+      <w:pPr>
+        <w:tabs>
+          <w:tab w:val="num" w:pos="5760"/>
+        </w:tabs>
+        <w:ind w:left="5760" w:hanging="360"/>
+      </w:pPr>
+    </w:lvl>
+    <w:lvl w:ilvl="8" w:tentative="1">
+      <w:start w:val="1"/>
+      <w:numFmt w:val="lowerLetter"/>
+      <w:lvlText w:val="%9."/>
+      <w:lvlJc w:val="left"/>
+      <w:pPr>
+        <w:tabs>
+          <w:tab w:val="num" w:pos="6480"/>
+        </w:tabs>
+        <w:ind w:left="6480" w:hanging="360"/>
+      </w:pPr>
+    </w:lvl>
+  </w:abstractNum>
+  <w:abstractNum w:abstractNumId="10" w15:restartNumberingAfterBreak="0">
     <w:nsid w:val="24F32D89"/>
     <w:multiLevelType w:val="multilevel"/>
     <w:tmpl w:val="51D84F0A"/>
@@ -8238,7 +9067,7 @@
       </w:pPr>
     </w:lvl>
   </w:abstractNum>
-  <w:abstractNum w:abstractNumId="9" w15:restartNumberingAfterBreak="0">
+  <w:abstractNum w:abstractNumId="11" w15:restartNumberingAfterBreak="0">
     <w:nsid w:val="252B0A8A"/>
     <w:multiLevelType w:val="multilevel"/>
     <w:tmpl w:val="0F84B5FE"/>
@@ -8351,7 +9180,7 @@
       </w:pPr>
     </w:lvl>
   </w:abstractNum>
-  <w:abstractNum w:abstractNumId="10" w15:restartNumberingAfterBreak="0">
+  <w:abstractNum w:abstractNumId="12" w15:restartNumberingAfterBreak="0">
     <w:nsid w:val="2F8B11A1"/>
     <w:multiLevelType w:val="multilevel"/>
     <w:tmpl w:val="F7FAE804"/>
@@ -8464,7 +9293,7 @@
       </w:pPr>
     </w:lvl>
   </w:abstractNum>
-  <w:abstractNum w:abstractNumId="11" w15:restartNumberingAfterBreak="0">
+  <w:abstractNum w:abstractNumId="13" w15:restartNumberingAfterBreak="0">
     <w:nsid w:val="31874746"/>
     <w:multiLevelType w:val="multilevel"/>
     <w:tmpl w:val="014E73E6"/>
@@ -8577,7 +9406,7 @@
       </w:pPr>
     </w:lvl>
   </w:abstractNum>
-  <w:abstractNum w:abstractNumId="12" w15:restartNumberingAfterBreak="0">
+  <w:abstractNum w:abstractNumId="14" w15:restartNumberingAfterBreak="0">
     <w:nsid w:val="334B6EEA"/>
     <w:multiLevelType w:val="multilevel"/>
     <w:tmpl w:val="CE1EDFB4"/>
@@ -8690,7 +9519,7 @@
       </w:pPr>
     </w:lvl>
   </w:abstractNum>
-  <w:abstractNum w:abstractNumId="13" w15:restartNumberingAfterBreak="0">
+  <w:abstractNum w:abstractNumId="15" w15:restartNumberingAfterBreak="0">
     <w:nsid w:val="34902DC4"/>
     <w:multiLevelType w:val="multilevel"/>
     <w:tmpl w:val="0D6C482C"/>
@@ -8803,7 +9632,7 @@
       </w:pPr>
     </w:lvl>
   </w:abstractNum>
-  <w:abstractNum w:abstractNumId="14" w15:restartNumberingAfterBreak="0">
+  <w:abstractNum w:abstractNumId="16" w15:restartNumberingAfterBreak="0">
     <w:nsid w:val="36BF0648"/>
     <w:multiLevelType w:val="multilevel"/>
     <w:tmpl w:val="57D61A14"/>
@@ -8916,7 +9745,7 @@
       </w:pPr>
     </w:lvl>
   </w:abstractNum>
-  <w:abstractNum w:abstractNumId="15" w15:restartNumberingAfterBreak="0">
+  <w:abstractNum w:abstractNumId="17" w15:restartNumberingAfterBreak="0">
     <w:nsid w:val="37156894"/>
     <w:multiLevelType w:val="multilevel"/>
     <w:tmpl w:val="A24E3D56"/>
@@ -9029,7 +9858,7 @@
       </w:pPr>
     </w:lvl>
   </w:abstractNum>
-  <w:abstractNum w:abstractNumId="16" w15:restartNumberingAfterBreak="0">
+  <w:abstractNum w:abstractNumId="18" w15:restartNumberingAfterBreak="0">
     <w:nsid w:val="3725326A"/>
     <w:multiLevelType w:val="multilevel"/>
     <w:tmpl w:val="A2226A52"/>
@@ -9142,7 +9971,7 @@
       </w:pPr>
     </w:lvl>
   </w:abstractNum>
-  <w:abstractNum w:abstractNumId="17" w15:restartNumberingAfterBreak="0">
+  <w:abstractNum w:abstractNumId="19" w15:restartNumberingAfterBreak="0">
     <w:nsid w:val="3A396E2A"/>
     <w:multiLevelType w:val="multilevel"/>
     <w:tmpl w:val="2A0A4FD8"/>
@@ -9255,7 +10084,7 @@
       </w:pPr>
     </w:lvl>
   </w:abstractNum>
-  <w:abstractNum w:abstractNumId="18" w15:restartNumberingAfterBreak="0">
+  <w:abstractNum w:abstractNumId="20" w15:restartNumberingAfterBreak="0">
     <w:nsid w:val="3CB65731"/>
     <w:multiLevelType w:val="multilevel"/>
     <w:tmpl w:val="9462EE02"/>
@@ -9368,7 +10197,7 @@
       </w:pPr>
     </w:lvl>
   </w:abstractNum>
-  <w:abstractNum w:abstractNumId="19" w15:restartNumberingAfterBreak="0">
+  <w:abstractNum w:abstractNumId="21" w15:restartNumberingAfterBreak="0">
     <w:nsid w:val="3D605951"/>
     <w:multiLevelType w:val="hybridMultilevel"/>
     <w:tmpl w:val="732CBFF0"/>
@@ -9481,7 +10310,7 @@
       </w:rPr>
     </w:lvl>
   </w:abstractNum>
-  <w:abstractNum w:abstractNumId="20" w15:restartNumberingAfterBreak="0">
+  <w:abstractNum w:abstractNumId="22" w15:restartNumberingAfterBreak="0">
     <w:nsid w:val="3DEF40DC"/>
     <w:multiLevelType w:val="multilevel"/>
     <w:tmpl w:val="E8C8F57C"/>
@@ -9594,7 +10423,7 @@
       </w:pPr>
     </w:lvl>
   </w:abstractNum>
-  <w:abstractNum w:abstractNumId="21" w15:restartNumberingAfterBreak="0">
+  <w:abstractNum w:abstractNumId="23" w15:restartNumberingAfterBreak="0">
     <w:nsid w:val="4A6717F8"/>
     <w:multiLevelType w:val="hybridMultilevel"/>
     <w:tmpl w:val="83DC0AC0"/>
@@ -9707,7 +10536,7 @@
       </w:rPr>
     </w:lvl>
   </w:abstractNum>
-  <w:abstractNum w:abstractNumId="22" w15:restartNumberingAfterBreak="0">
+  <w:abstractNum w:abstractNumId="24" w15:restartNumberingAfterBreak="0">
     <w:nsid w:val="4ECFC472"/>
     <w:multiLevelType w:val="multilevel"/>
     <w:tmpl w:val="3A145D8C"/>
@@ -9849,7 +10678,7 @@
       </w:rPr>
     </w:lvl>
   </w:abstractNum>
-  <w:abstractNum w:abstractNumId="23" w15:restartNumberingAfterBreak="0">
+  <w:abstractNum w:abstractNumId="25" w15:restartNumberingAfterBreak="0">
     <w:nsid w:val="4F4A051A"/>
     <w:multiLevelType w:val="multilevel"/>
     <w:tmpl w:val="DECE0D16"/>
@@ -9962,7 +10791,7 @@
       </w:pPr>
     </w:lvl>
   </w:abstractNum>
-  <w:abstractNum w:abstractNumId="24" w15:restartNumberingAfterBreak="0">
+  <w:abstractNum w:abstractNumId="26" w15:restartNumberingAfterBreak="0">
     <w:nsid w:val="52FA075A"/>
     <w:multiLevelType w:val="multilevel"/>
     <w:tmpl w:val="681212EC"/>
@@ -10075,7 +10904,7 @@
       </w:pPr>
     </w:lvl>
   </w:abstractNum>
-  <w:abstractNum w:abstractNumId="25" w15:restartNumberingAfterBreak="0">
+  <w:abstractNum w:abstractNumId="27" w15:restartNumberingAfterBreak="0">
     <w:nsid w:val="568A2CF0"/>
     <w:multiLevelType w:val="multilevel"/>
     <w:tmpl w:val="769E1524"/>
@@ -10188,7 +11017,7 @@
       </w:pPr>
     </w:lvl>
   </w:abstractNum>
-  <w:abstractNum w:abstractNumId="26" w15:restartNumberingAfterBreak="0">
+  <w:abstractNum w:abstractNumId="28" w15:restartNumberingAfterBreak="0">
     <w:nsid w:val="5A013160"/>
     <w:multiLevelType w:val="multilevel"/>
     <w:tmpl w:val="CC520746"/>
@@ -10301,7 +11130,7 @@
       </w:pPr>
     </w:lvl>
   </w:abstractNum>
-  <w:abstractNum w:abstractNumId="27" w15:restartNumberingAfterBreak="0">
+  <w:abstractNum w:abstractNumId="29" w15:restartNumberingAfterBreak="0">
     <w:nsid w:val="5B59E84F"/>
     <w:multiLevelType w:val="multilevel"/>
     <w:tmpl w:val="C01EEEFC"/>
@@ -10423,7 +11252,7 @@
       </w:pPr>
     </w:lvl>
   </w:abstractNum>
-  <w:abstractNum w:abstractNumId="28" w15:restartNumberingAfterBreak="0">
+  <w:abstractNum w:abstractNumId="30" w15:restartNumberingAfterBreak="0">
     <w:nsid w:val="637078CB"/>
     <w:multiLevelType w:val="multilevel"/>
     <w:tmpl w:val="B882C5EA"/>
@@ -10536,7 +11365,120 @@
       </w:pPr>
     </w:lvl>
   </w:abstractNum>
-  <w:abstractNum w:abstractNumId="29" w15:restartNumberingAfterBreak="0">
+  <w:abstractNum w:abstractNumId="31" w15:restartNumberingAfterBreak="0">
+    <w:nsid w:val="71CE341F"/>
+    <w:multiLevelType w:val="multilevel"/>
+    <w:tmpl w:val="AAC4C124"/>
+    <w:lvl w:ilvl="0">
+      <w:start w:val="1"/>
+      <w:numFmt w:val="lowerLetter"/>
+      <w:lvlText w:val="%1."/>
+      <w:lvlJc w:val="left"/>
+      <w:pPr>
+        <w:tabs>
+          <w:tab w:val="num" w:pos="720"/>
+        </w:tabs>
+        <w:ind w:left="720" w:hanging="360"/>
+      </w:pPr>
+    </w:lvl>
+    <w:lvl w:ilvl="1" w:tentative="1">
+      <w:start w:val="1"/>
+      <w:numFmt w:val="lowerLetter"/>
+      <w:lvlText w:val="%2."/>
+      <w:lvlJc w:val="left"/>
+      <w:pPr>
+        <w:tabs>
+          <w:tab w:val="num" w:pos="1440"/>
+        </w:tabs>
+        <w:ind w:left="1440" w:hanging="360"/>
+      </w:pPr>
+    </w:lvl>
+    <w:lvl w:ilvl="2" w:tentative="1">
+      <w:start w:val="1"/>
+      <w:numFmt w:val="lowerLetter"/>
+      <w:lvlText w:val="%3."/>
+      <w:lvlJc w:val="left"/>
+      <w:pPr>
+        <w:tabs>
+          <w:tab w:val="num" w:pos="2160"/>
+        </w:tabs>
+        <w:ind w:left="2160" w:hanging="360"/>
+      </w:pPr>
+    </w:lvl>
+    <w:lvl w:ilvl="3" w:tentative="1">
+      <w:start w:val="1"/>
+      <w:numFmt w:val="lowerLetter"/>
+      <w:lvlText w:val="%4."/>
+      <w:lvlJc w:val="left"/>
+      <w:pPr>
+        <w:tabs>
+          <w:tab w:val="num" w:pos="2880"/>
+        </w:tabs>
+        <w:ind w:left="2880" w:hanging="360"/>
+      </w:pPr>
+    </w:lvl>
+    <w:lvl w:ilvl="4" w:tentative="1">
+      <w:start w:val="1"/>
+      <w:numFmt w:val="lowerLetter"/>
+      <w:lvlText w:val="%5."/>
+      <w:lvlJc w:val="left"/>
+      <w:pPr>
+        <w:tabs>
+          <w:tab w:val="num" w:pos="3600"/>
+        </w:tabs>
+        <w:ind w:left="3600" w:hanging="360"/>
+      </w:pPr>
+    </w:lvl>
+    <w:lvl w:ilvl="5" w:tentative="1">
+      <w:start w:val="1"/>
+      <w:numFmt w:val="lowerLetter"/>
+      <w:lvlText w:val="%6."/>
+      <w:lvlJc w:val="left"/>
+      <w:pPr>
+        <w:tabs>
+          <w:tab w:val="num" w:pos="4320"/>
+        </w:tabs>
+        <w:ind w:left="4320" w:hanging="360"/>
+      </w:pPr>
+    </w:lvl>
+    <w:lvl w:ilvl="6" w:tentative="1">
+      <w:start w:val="1"/>
+      <w:numFmt w:val="lowerLetter"/>
+      <w:lvlText w:val="%7."/>
+      <w:lvlJc w:val="left"/>
+      <w:pPr>
+        <w:tabs>
+          <w:tab w:val="num" w:pos="5040"/>
+        </w:tabs>
+        <w:ind w:left="5040" w:hanging="360"/>
+      </w:pPr>
+    </w:lvl>
+    <w:lvl w:ilvl="7" w:tentative="1">
+      <w:start w:val="1"/>
+      <w:numFmt w:val="lowerLetter"/>
+      <w:lvlText w:val="%8."/>
+      <w:lvlJc w:val="left"/>
+      <w:pPr>
+        <w:tabs>
+          <w:tab w:val="num" w:pos="5760"/>
+        </w:tabs>
+        <w:ind w:left="5760" w:hanging="360"/>
+      </w:pPr>
+    </w:lvl>
+    <w:lvl w:ilvl="8" w:tentative="1">
+      <w:start w:val="1"/>
+      <w:numFmt w:val="lowerLetter"/>
+      <w:lvlText w:val="%9."/>
+      <w:lvlJc w:val="left"/>
+      <w:pPr>
+        <w:tabs>
+          <w:tab w:val="num" w:pos="6480"/>
+        </w:tabs>
+        <w:ind w:left="6480" w:hanging="360"/>
+      </w:pPr>
+    </w:lvl>
+  </w:abstractNum>
+  <w:abstractNum w:abstractNumId="32" w15:restartNumberingAfterBreak="0">
     <w:nsid w:val="77FF39F2"/>
     <w:multiLevelType w:val="hybridMultilevel"/>
     <w:tmpl w:val="1DDE3338"/>
@@ -10649,7 +11591,7 @@
       </w:rPr>
     </w:lvl>
   </w:abstractNum>
-  <w:abstractNum w:abstractNumId="30" w15:restartNumberingAfterBreak="0">
+  <w:abstractNum w:abstractNumId="33" w15:restartNumberingAfterBreak="0">
     <w:nsid w:val="78C8E0DD"/>
     <w:multiLevelType w:val="multilevel"/>
     <w:tmpl w:val="96049F3E"/>
@@ -10791,97 +11733,106 @@
     </w:lvl>
   </w:abstractNum>
   <w:num w:numId="1">
-    <w:abstractNumId w:val="6"/>
+    <w:abstractNumId w:val="7"/>
   </w:num>
   <w:num w:numId="2">
     <w:abstractNumId w:val="0"/>
   </w:num>
   <w:num w:numId="3">
+    <w:abstractNumId w:val="33"/>
+  </w:num>
+  <w:num w:numId="4">
+    <w:abstractNumId w:val="24"/>
+  </w:num>
+  <w:num w:numId="5">
+    <w:abstractNumId w:val="4"/>
+  </w:num>
+  <w:num w:numId="6">
+    <w:abstractNumId w:val="29"/>
+  </w:num>
+  <w:num w:numId="7">
+    <w:abstractNumId w:val="21"/>
+  </w:num>
+  <w:num w:numId="8">
     <w:abstractNumId w:val="30"/>
   </w:num>
-  <w:num w:numId="4">
+  <w:num w:numId="9">
+    <w:abstractNumId w:val="12"/>
+  </w:num>
+  <w:num w:numId="10">
+    <w:abstractNumId w:val="3"/>
+  </w:num>
+  <w:num w:numId="11">
+    <w:abstractNumId w:val="14"/>
+  </w:num>
+  <w:num w:numId="12">
+    <w:abstractNumId w:val="20"/>
+  </w:num>
+  <w:num w:numId="13">
+    <w:abstractNumId w:val="25"/>
+  </w:num>
+  <w:num w:numId="14">
+    <w:abstractNumId w:val="26"/>
+  </w:num>
+  <w:num w:numId="15">
+    <w:abstractNumId w:val="13"/>
+  </w:num>
+  <w:num w:numId="16">
+    <w:abstractNumId w:val="5"/>
+  </w:num>
+  <w:num w:numId="17">
+    <w:abstractNumId w:val="8"/>
+  </w:num>
+  <w:num w:numId="18">
+    <w:abstractNumId w:val="11"/>
+  </w:num>
+  <w:num w:numId="19">
+    <w:abstractNumId w:val="6"/>
+  </w:num>
+  <w:num w:numId="20">
     <w:abstractNumId w:val="22"/>
   </w:num>
-  <w:num w:numId="5">
-    <w:abstractNumId w:val="3"/>
+  <w:num w:numId="21">
+    <w:abstractNumId w:val="17"/>
   </w:num>
-  <w:num w:numId="6">
-    <w:abstractNumId w:val="27"/>
-  </w:num>
-  <w:num w:numId="7">
+  <w:num w:numId="22">
     <w:abstractNumId w:val="19"/>
   </w:num>
-  <w:num w:numId="8">
-    <w:abstractNumId w:val="28"/>
-  </w:num>
-  <w:num w:numId="9">
-    <w:abstractNumId w:val="10"/>
-  </w:num>
-  <w:num w:numId="10">
-    <w:abstractNumId w:val="2"/>
-  </w:num>
-  <w:num w:numId="11">
-    <w:abstractNumId w:val="12"/>
-  </w:num>
-  <w:num w:numId="12">
-    <w:abstractNumId w:val="18"/>
-  </w:num>
-  <w:num w:numId="13">
+  <w:num w:numId="23">
     <w:abstractNumId w:val="23"/>
-  </w:num>
-  <w:num w:numId="14">
-    <w:abstractNumId w:val="24"/>
-  </w:num>
-  <w:num w:numId="15">
-    <w:abstractNumId w:val="11"/>
-  </w:num>
-  <w:num w:numId="16">
-    <w:abstractNumId w:val="4"/>
-  </w:num>
-  <w:num w:numId="17">
-    <w:abstractNumId w:val="7"/>
-  </w:num>
-  <w:num w:numId="18">
-    <w:abstractNumId w:val="9"/>
-  </w:num>
-  <w:num w:numId="19">
-    <w:abstractNumId w:val="5"/>
-  </w:num>
-  <w:num w:numId="20">
-    <w:abstractNumId w:val="20"/>
-  </w:num>
-  <w:num w:numId="21">
-    <w:abstractNumId w:val="15"/>
-  </w:num>
-  <w:num w:numId="22">
-    <w:abstractNumId w:val="17"/>
-  </w:num>
-  <w:num w:numId="23">
-    <w:abstractNumId w:val="21"/>
   </w:num>
   <w:num w:numId="24">
     <w:abstractNumId w:val="1"/>
   </w:num>
   <w:num w:numId="25">
-    <w:abstractNumId w:val="29"/>
+    <w:abstractNumId w:val="32"/>
   </w:num>
   <w:num w:numId="26">
-    <w:abstractNumId w:val="26"/>
+    <w:abstractNumId w:val="28"/>
   </w:num>
   <w:num w:numId="27">
-    <w:abstractNumId w:val="8"/>
+    <w:abstractNumId w:val="10"/>
   </w:num>
   <w:num w:numId="28">
-    <w:abstractNumId w:val="13"/>
+    <w:abstractNumId w:val="15"/>
   </w:num>
   <w:num w:numId="29">
-    <w:abstractNumId w:val="25"/>
+    <w:abstractNumId w:val="27"/>
   </w:num>
   <w:num w:numId="30">
-    <w:abstractNumId w:val="14"/>
+    <w:abstractNumId w:val="16"/>
   </w:num>
   <w:num w:numId="31">
-    <w:abstractNumId w:val="16"/>
+    <w:abstractNumId w:val="18"/>
+  </w:num>
+  <w:num w:numId="32">
+    <w:abstractNumId w:val="31"/>
+  </w:num>
+  <w:num w:numId="33">
+    <w:abstractNumId w:val="2"/>
+  </w:num>
+  <w:num w:numId="34">
+    <w:abstractNumId w:val="9"/>
   </w:num>
 </w:numbering>
 </file>
@@ -12112,7 +13063,7 @@
 </file>
 
 <file path=customXml/itemProps4.xml><?xml version="1.0" encoding="utf-8"?>
-<ds:datastoreItem xmlns:ds="http://schemas.openxmlformats.org/officeDocument/2006/customXml" ds:itemID="{0DEDAF6A-DA18-450F-A88C-4AB7DDCF653E}">
+<ds:datastoreItem xmlns:ds="http://schemas.openxmlformats.org/officeDocument/2006/customXml" ds:itemID="{B51F7523-5DBF-49A9-A077-6EFF80070CCC}">
   <ds:schemaRefs>
     <ds:schemaRef ds:uri="http://schemas.openxmlformats.org/officeDocument/2006/bibliography"/>
   </ds:schemaRefs>

</xml_diff>